<commit_message>
added literature and new PDM formatting
</commit_message>
<xml_diff>
--- a/admin/Project management/PDMP(caa17.10.25) no cover page.docx
+++ b/admin/Project management/PDMP(caa17.10.25) no cover page.docx
@@ -1852,6 +1852,60 @@
         <w:spacing w:before="0" w:beforeAutospacing="0" w:after="0" w:afterAutospacing="0"/>
         <w:jc w:val="both"/>
       </w:pPr>
+    </w:p>
+    <w:p>
+      <w:pPr>
+        <w:spacing w:line="259" w:lineRule="auto"/>
+        <w:rPr>
+          <w:rFonts w:eastAsia="Times New Roman"/>
+          <w:lang w:val="en-SG" w:eastAsia="zh-CN"/>
+        </w:rPr>
+      </w:pPr>
+      <w:r>
+        <w:br w:type="page"/>
+      </w:r>
+    </w:p>
+    <w:p>
+      <w:pPr>
+        <w:pStyle w:val="Heading3"/>
+      </w:pPr>
+      <w:r>
+        <w:lastRenderedPageBreak/>
+        <w:t>Notes</w:t>
+      </w:r>
+    </w:p>
+    <w:p>
+      <w:pPr>
+        <w:pStyle w:val="BodyText"/>
+        <w:spacing w:line="240" w:lineRule="auto"/>
+      </w:pPr>
+      <w:r>
+        <w:t xml:space="preserve">What do you mean by “truly understand”? Possible operationalizations include: robust generalization to novel moral dilemmas, consistency under adversarial perturbations, counterfactual sensitivity, causal reasoning about moral outcomes, or self-explanation that tracks ground-truth normative principles rather than surface cues. Which of these (or others) best matches your intent? What model class and scale are you targeting (e.g., LLMs, small transformer probes, multimodal models), and do you want to compare pretraining-only vs instruction-tuned vs RLHF vs mechanistic-intervention variants? How will you instantiate “moral ethics—both relative and absolute”? For example: Relative: culturally or context-dependent norms, pluralistic ethics, role-based norms. Absolute: deontology, utilitarian calculus with fixed objectives, </w:t>
+      </w:r>
+      <w:proofErr w:type="spellStart"/>
+      <w:r>
+        <w:t>contractualism</w:t>
+      </w:r>
+      <w:proofErr w:type="spellEnd"/>
+      <w:r>
+        <w:t xml:space="preserve">, or formal rule-sets. Which frameworks and datasets (or new data) do you plan to use? What’s your evidence criterion to distinguish “understanding” from “mimicry”? Options include: Out-of-distribution moral reasoning with explicit justification grounded in principles; Invariance across </w:t>
+      </w:r>
+      <w:proofErr w:type="spellStart"/>
+      <w:r>
+        <w:t>rephrasings</w:t>
+      </w:r>
+      <w:proofErr w:type="spellEnd"/>
+      <w:r>
+        <w:t xml:space="preserve"> and hidden-variable swaps; Causal abstraction alignment (mech </w:t>
+      </w:r>
+      <w:proofErr w:type="spellStart"/>
+      <w:r>
+        <w:t>interp</w:t>
+      </w:r>
+      <w:proofErr w:type="spellEnd"/>
+      <w:r>
+        <w:t xml:space="preserve"> linking internal circuits to moral constructs); Preference identification under novel trade-offs; Behavioral alignment under counterfactual feedback. Do you want a single composite benchmark or multiple targeted probes (e.g., trolley variants, double-effect, fairness vs utility trade-offs, conflicting authority instructions, cross-cultural dilemmas)? Are you aiming to test learning dynamics (does “understanding” emerge with scale, data diversity, or training objectives), or only to evaluate static models? Any constraints on domains (medical triage, autonomous driving, content moderation, resource allocation), languages/cultures, or safety policies? Proposed structure (for you to accept/adjust): Compare families of models across two training regimes: (A) principle-grounded moral tutoring (explicit rules and reasons) vs (B) exemplar imitation (surface patterns). Evaluate on a suite of adversarial and counterfactual moral tests spanning absolute and relative ethics, with mechanistic probes to see whether internal representations track principles vs lexical correlations. Primary outcome: operational “understanding” defined as principled generalization and causal invariance, not just accuracy on seen formats. Once you confirm the above choices (especially the operational definition of “understanding” and which moral frameworks to include), I’ll crystallize the topic statement precisely.</w:t>
+      </w:r>
     </w:p>
     <w:sectPr>
       <w:headerReference w:type="default" r:id="rId18"/>
@@ -5477,7 +5531,6 @@
   <w:style w:type="character" w:default="1" w:styleId="DefaultParagraphFont">
     <w:name w:val="Default Paragraph Font"/>
     <w:uiPriority w:val="1"/>
-    <w:semiHidden/>
     <w:unhideWhenUsed/>
   </w:style>
   <w:style w:type="table" w:default="1" w:styleId="TableNormal">
@@ -6716,17 +6769,19 @@
 </file>
 
 <file path=customXml/item1.xml><?xml version="1.0" encoding="utf-8"?>
-<p:properties xmlns:p="http://schemas.microsoft.com/office/2006/metadata/properties" xmlns:xsi="http://www.w3.org/2001/XMLSchema-instance" xmlns:pc="http://schemas.microsoft.com/office/infopath/2007/PartnerControls">
-  <documentManagement>
-    <TaxCatchAll xmlns="b547c7a7-201d-4fd1-b061-320e39927fa6" xsi:nil="true"/>
-    <lcf76f155ced4ddcb4097134ff3c332f xmlns="8fa0fc1d-bd80-47fb-a35f-9b4442274e73">
-      <Terms xmlns="http://schemas.microsoft.com/office/infopath/2007/PartnerControls"/>
-    </lcf76f155ced4ddcb4097134ff3c332f>
-  </documentManagement>
-</p:properties>
+<?mso-contentType ?>
+<FormTemplates xmlns="http://schemas.microsoft.com/sharepoint/v3/contenttype/forms">
+  <Display>DocumentLibraryForm</Display>
+  <Edit>DocumentLibraryForm</Edit>
+  <New>DocumentLibraryForm</New>
+</FormTemplates>
 </file>
 
 <file path=customXml/item2.xml><?xml version="1.0" encoding="utf-8"?>
+<b:Sources xmlns:b="http://schemas.openxmlformats.org/officeDocument/2006/bibliography" xmlns="http://schemas.openxmlformats.org/officeDocument/2006/bibliography" SelectedStyle="\CHICAGO.XSL" StyleName="Chicago" Version="16"/>
+</file>
+
+<file path=customXml/item3.xml><?xml version="1.0" encoding="utf-8"?>
 <ct:contentTypeSchema xmlns:ct="http://schemas.microsoft.com/office/2006/metadata/contentType" xmlns:ma="http://schemas.microsoft.com/office/2006/metadata/properties/metaAttributes" ct:_="" ma:_="" ma:contentTypeName="Document" ma:contentTypeID="0x010100276E619CE5B0C9458323E0289773CDB2" ma:contentTypeVersion="13" ma:contentTypeDescription="Create a new document." ma:contentTypeScope="" ma:versionID="a63989fa12e49b30413b2cc17eee567c">
   <xsd:schema xmlns:xsd="http://www.w3.org/2001/XMLSchema" xmlns:xs="http://www.w3.org/2001/XMLSchema" xmlns:p="http://schemas.microsoft.com/office/2006/metadata/properties" xmlns:ns2="8fa0fc1d-bd80-47fb-a35f-9b4442274e73" xmlns:ns3="b547c7a7-201d-4fd1-b061-320e39927fa6" targetNamespace="http://schemas.microsoft.com/office/2006/metadata/properties" ma:root="true" ma:fieldsID="97c49544893c4cf780a07531db0e7f35" ns2:_="" ns3:_="">
     <xsd:import namespace="8fa0fc1d-bd80-47fb-a35f-9b4442274e73"/>
@@ -6935,31 +6990,34 @@
 </ct:contentTypeSchema>
 </file>
 
-<file path=customXml/item3.xml><?xml version="1.0" encoding="utf-8"?>
-<b:Sources xmlns:b="http://schemas.openxmlformats.org/officeDocument/2006/bibliography" xmlns="http://schemas.openxmlformats.org/officeDocument/2006/bibliography" SelectedStyle="\CHICAGO.XSL" StyleName="Chicago" Version="16"/>
-</file>
-
 <file path=customXml/item4.xml><?xml version="1.0" encoding="utf-8"?>
-<?mso-contentType ?>
-<FormTemplates xmlns="http://schemas.microsoft.com/sharepoint/v3/contenttype/forms">
-  <Display>DocumentLibraryForm</Display>
-  <Edit>DocumentLibraryForm</Edit>
-  <New>DocumentLibraryForm</New>
-</FormTemplates>
+<p:properties xmlns:p="http://schemas.microsoft.com/office/2006/metadata/properties" xmlns:xsi="http://www.w3.org/2001/XMLSchema-instance" xmlns:pc="http://schemas.microsoft.com/office/infopath/2007/PartnerControls">
+  <documentManagement>
+    <TaxCatchAll xmlns="b547c7a7-201d-4fd1-b061-320e39927fa6" xsi:nil="true"/>
+    <lcf76f155ced4ddcb4097134ff3c332f xmlns="8fa0fc1d-bd80-47fb-a35f-9b4442274e73">
+      <Terms xmlns="http://schemas.microsoft.com/office/infopath/2007/PartnerControls"/>
+    </lcf76f155ced4ddcb4097134ff3c332f>
+  </documentManagement>
+</p:properties>
 </file>
 
 <file path=customXml/itemProps1.xml><?xml version="1.0" encoding="utf-8"?>
-<ds:datastoreItem xmlns:ds="http://schemas.openxmlformats.org/officeDocument/2006/customXml" ds:itemID="{2ACA577D-FEEF-482F-BA77-960FB70F6C19}">
+<ds:datastoreItem xmlns:ds="http://schemas.openxmlformats.org/officeDocument/2006/customXml" ds:itemID="{9801C557-CEF7-427D-B819-762B914EB920}">
   <ds:schemaRefs>
-    <ds:schemaRef ds:uri="http://schemas.microsoft.com/office/2006/metadata/properties"/>
-    <ds:schemaRef ds:uri="http://schemas.microsoft.com/office/infopath/2007/PartnerControls"/>
-    <ds:schemaRef ds:uri="b547c7a7-201d-4fd1-b061-320e39927fa6"/>
-    <ds:schemaRef ds:uri="8fa0fc1d-bd80-47fb-a35f-9b4442274e73"/>
+    <ds:schemaRef ds:uri="http://schemas.microsoft.com/sharepoint/v3/contenttype/forms"/>
   </ds:schemaRefs>
 </ds:datastoreItem>
 </file>
 
 <file path=customXml/itemProps2.xml><?xml version="1.0" encoding="utf-8"?>
+<ds:datastoreItem xmlns:ds="http://schemas.openxmlformats.org/officeDocument/2006/customXml" ds:itemID="{60C05EF6-3C86-4BF8-8F65-939956D2A6F8}">
+  <ds:schemaRefs>
+    <ds:schemaRef ds:uri="http://schemas.openxmlformats.org/officeDocument/2006/bibliography"/>
+  </ds:schemaRefs>
+</ds:datastoreItem>
+</file>
+
+<file path=customXml/itemProps3.xml><?xml version="1.0" encoding="utf-8"?>
 <ds:datastoreItem xmlns:ds="http://schemas.openxmlformats.org/officeDocument/2006/customXml" ds:itemID="{1D4DC707-92E4-4316-A04E-EB82A5B6829D}">
   <ds:schemaRefs>
     <ds:schemaRef ds:uri="http://schemas.microsoft.com/office/2006/metadata/contentType"/>
@@ -6978,18 +7036,13 @@
 </ds:datastoreItem>
 </file>
 
-<file path=customXml/itemProps3.xml><?xml version="1.0" encoding="utf-8"?>
-<ds:datastoreItem xmlns:ds="http://schemas.openxmlformats.org/officeDocument/2006/customXml" ds:itemID="{60C05EF6-3C86-4BF8-8F65-939956D2A6F8}">
+<file path=customXml/itemProps4.xml><?xml version="1.0" encoding="utf-8"?>
+<ds:datastoreItem xmlns:ds="http://schemas.openxmlformats.org/officeDocument/2006/customXml" ds:itemID="{2ACA577D-FEEF-482F-BA77-960FB70F6C19}">
   <ds:schemaRefs>
-    <ds:schemaRef ds:uri="http://schemas.openxmlformats.org/officeDocument/2006/bibliography"/>
-  </ds:schemaRefs>
-</ds:datastoreItem>
-</file>
-
-<file path=customXml/itemProps4.xml><?xml version="1.0" encoding="utf-8"?>
-<ds:datastoreItem xmlns:ds="http://schemas.openxmlformats.org/officeDocument/2006/customXml" ds:itemID="{9801C557-CEF7-427D-B819-762B914EB920}">
-  <ds:schemaRefs>
-    <ds:schemaRef ds:uri="http://schemas.microsoft.com/sharepoint/v3/contenttype/forms"/>
+    <ds:schemaRef ds:uri="http://schemas.microsoft.com/office/2006/metadata/properties"/>
+    <ds:schemaRef ds:uri="http://schemas.microsoft.com/office/infopath/2007/PartnerControls"/>
+    <ds:schemaRef ds:uri="b547c7a7-201d-4fd1-b061-320e39927fa6"/>
+    <ds:schemaRef ds:uri="8fa0fc1d-bd80-47fb-a35f-9b4442274e73"/>
   </ds:schemaRefs>
 </ds:datastoreItem>
 </file>
</xml_diff>